<commit_message>
📝 Upload Activity_IX doc / pdf
</commit_message>
<xml_diff>
--- a/Activity_IX-Buffer_Overflow_Attacks/Activity_IX-Buffer_Overflow_Attacks(Solution).docx
+++ b/Activity_IX-Buffer_Overflow_Attacks/Activity_IX-Buffer_Overflow_Attacks(Solution).docx
@@ -10,6 +10,9 @@
           <w:numId w:val="1"/>
         </w:numPr>
         <w:shd w:val="clear" w:color="auto" w:fill="FFFFFF"/>
+        <w:rPr>
+          <w:rFonts w:ascii="PalatinoLTPro" w:hAnsi="PalatinoLTPro"/>
+        </w:rPr>
       </w:pPr>
       <w:r>
         <w:rPr>
@@ -21,26 +24,28 @@
     <w:p>
       <w:pPr>
         <w:rPr>
-          <w:lang w:val="en-US"/>
-        </w:rPr>
-      </w:pPr>
-    </w:p>
-    <w:p>
-      <w:pPr>
-        <w:rPr>
+          <w:rFonts w:ascii="PalatinoLTPro" w:hAnsi="PalatinoLTPro"/>
+          <w:lang w:val="en-US"/>
+        </w:rPr>
+      </w:pPr>
+    </w:p>
+    <w:p>
+      <w:pPr>
+        <w:rPr>
+          <w:rFonts w:ascii="PalatinoLTPro" w:hAnsi="PalatinoLTPro"/>
           <w:lang w:val="en-US"/>
         </w:rPr>
       </w:pPr>
       <w:r>
         <w:rPr>
-          <w:noProof/>
+          <w:rFonts w:ascii="PalatinoLTPro" w:hAnsi="PalatinoLTPro"/>
           <w:lang w:val="en-US"/>
         </w:rPr>
         <w:drawing>
-          <wp:inline distT="0" distB="0" distL="0" distR="0" wp14:anchorId="0CD14167" wp14:editId="1287A244">
-            <wp:extent cx="5943600" cy="2328545"/>
+          <wp:inline distT="0" distB="0" distL="0" distR="0" wp14:anchorId="12EB9953" wp14:editId="29A05C5A">
+            <wp:extent cx="5943600" cy="2844165"/>
             <wp:effectExtent l="0" t="0" r="0" b="0"/>
-            <wp:docPr id="1" name="Picture 1" descr="Table&#10;&#10;Description automatically generated"/>
+            <wp:docPr id="1" name="Picture 1" descr="Graphical user interface, text&#10;&#10;Description automatically generated"/>
             <wp:cNvGraphicFramePr>
               <a:graphicFrameLocks xmlns:a="http://schemas.openxmlformats.org/drawingml/2006/main" noChangeAspect="1"/>
             </wp:cNvGraphicFramePr>
@@ -48,7 +53,7 @@
               <a:graphicData uri="http://schemas.openxmlformats.org/drawingml/2006/picture">
                 <pic:pic xmlns:pic="http://schemas.openxmlformats.org/drawingml/2006/picture">
                   <pic:nvPicPr>
-                    <pic:cNvPr id="1" name="Picture 1" descr="Table&#10;&#10;Description automatically generated"/>
+                    <pic:cNvPr id="1" name="Picture 1" descr="Graphical user interface, text&#10;&#10;Description automatically generated"/>
                     <pic:cNvPicPr/>
                   </pic:nvPicPr>
                   <pic:blipFill>
@@ -60,7 +65,7 @@
                   <pic:spPr>
                     <a:xfrm>
                       <a:off x="0" y="0"/>
-                      <a:ext cx="5943600" cy="2328545"/>
+                      <a:ext cx="5943600" cy="2844165"/>
                     </a:xfrm>
                     <a:prstGeom prst="rect">
                       <a:avLst/>
@@ -76,6 +81,7 @@
     <w:p>
       <w:pPr>
         <w:rPr>
+          <w:rFonts w:ascii="PalatinoLTPro" w:hAnsi="PalatinoLTPro"/>
           <w:lang w:val="en-US"/>
         </w:rPr>
       </w:pPr>
@@ -84,6 +90,7 @@
       <w:pPr>
         <w:pStyle w:val="ListParagraph"/>
         <w:rPr>
+          <w:rFonts w:ascii="PalatinoLTPro" w:hAnsi="PalatinoLTPro"/>
           <w:lang w:val="en-US"/>
         </w:rPr>
       </w:pPr>
@@ -96,45 +103,42 @@
           <w:numId w:val="1"/>
         </w:numPr>
         <w:rPr>
+          <w:rFonts w:ascii="PalatinoLTPro" w:hAnsi="PalatinoLTPro"/>
           <w:lang w:val="en-US"/>
         </w:rPr>
       </w:pPr>
       <w:r>
         <w:rPr>
-          <w:lang w:val="en-US"/>
-        </w:rPr>
-        <w:t>S</w:t>
+          <w:rFonts w:ascii="PalatinoLTPro" w:hAnsi="PalatinoLTPro"/>
+        </w:rPr>
+        <w:t>Stack Smashing:</w:t>
       </w:r>
+    </w:p>
+    <w:p>
+      <w:pPr>
+        <w:rPr>
+          <w:rFonts w:ascii="PalatinoLTPro" w:hAnsi="PalatinoLTPro"/>
+          <w:lang w:val="en-US"/>
+        </w:rPr>
+      </w:pPr>
+    </w:p>
+    <w:p>
+      <w:pPr>
+        <w:rPr>
+          <w:rFonts w:ascii="PalatinoLTPro" w:hAnsi="PalatinoLTPro"/>
+          <w:lang w:val="en-US"/>
+        </w:rPr>
+      </w:pPr>
       <w:r>
         <w:rPr>
-          <w:lang w:val="en-US"/>
-        </w:rPr>
-        <w:t>s</w:t>
-      </w:r>
-    </w:p>
-    <w:p>
-      <w:pPr>
-        <w:rPr>
-          <w:lang w:val="en-US"/>
-        </w:rPr>
-      </w:pPr>
-    </w:p>
-    <w:p>
-      <w:pPr>
-        <w:rPr>
-          <w:lang w:val="en-US"/>
-        </w:rPr>
-      </w:pPr>
-      <w:r>
-        <w:rPr>
-          <w:cs/>
+          <w:rFonts w:ascii="PalatinoLTPro" w:hAnsi="PalatinoLTPro"/>
           <w:lang w:val="en-US"/>
         </w:rPr>
         <w:drawing>
-          <wp:inline distT="0" distB="0" distL="0" distR="0" wp14:anchorId="5D558A63" wp14:editId="4944795C">
-            <wp:extent cx="5943600" cy="4076700"/>
+          <wp:inline distT="0" distB="0" distL="0" distR="0" wp14:anchorId="79DBCED2" wp14:editId="73D0A157">
+            <wp:extent cx="5943600" cy="2175510"/>
             <wp:effectExtent l="0" t="0" r="0" b="0"/>
-            <wp:docPr id="2" name="Picture 2" descr="Table&#10;&#10;Description automatically generated"/>
+            <wp:docPr id="4" name="Picture 4" descr="Text&#10;&#10;Description automatically generated"/>
             <wp:cNvGraphicFramePr>
               <a:graphicFrameLocks xmlns:a="http://schemas.openxmlformats.org/drawingml/2006/main" noChangeAspect="1"/>
             </wp:cNvGraphicFramePr>
@@ -142,7 +146,7 @@
               <a:graphicData uri="http://schemas.openxmlformats.org/drawingml/2006/picture">
                 <pic:pic xmlns:pic="http://schemas.openxmlformats.org/drawingml/2006/picture">
                   <pic:nvPicPr>
-                    <pic:cNvPr id="2" name="Picture 2" descr="Table&#10;&#10;Description automatically generated"/>
+                    <pic:cNvPr id="4" name="Picture 4" descr="Text&#10;&#10;Description automatically generated"/>
                     <pic:cNvPicPr/>
                   </pic:nvPicPr>
                   <pic:blipFill>
@@ -154,7 +158,7 @@
                   <pic:spPr>
                     <a:xfrm>
                       <a:off x="0" y="0"/>
-                      <a:ext cx="5943600" cy="4076700"/>
+                      <a:ext cx="5943600" cy="2175510"/>
                     </a:xfrm>
                     <a:prstGeom prst="rect">
                       <a:avLst/>
@@ -170,19 +174,79 @@
     <w:p>
       <w:pPr>
         <w:rPr>
+          <w:rFonts w:ascii="PalatinoLTPro" w:hAnsi="PalatinoLTPro"/>
+          <w:lang w:val="en-US"/>
+        </w:rPr>
+      </w:pPr>
+    </w:p>
+    <w:p>
+      <w:pPr>
+        <w:rPr>
+          <w:rFonts w:ascii="PalatinoLTPro" w:hAnsi="PalatinoLTPro"/>
           <w:lang w:val="en-US"/>
         </w:rPr>
       </w:pPr>
       <w:r>
         <w:rPr>
-          <w:lang w:val="en-US"/>
+          <w:rFonts w:ascii="PalatinoLTPro" w:hAnsi="PalatinoLTPro"/>
+          <w:lang w:val="en-US"/>
+        </w:rPr>
+        <w:br w:type="page"/>
+      </w:r>
+    </w:p>
+    <w:p>
+      <w:pPr>
+        <w:pStyle w:val="ListParagraph"/>
+        <w:numPr>
+          <w:ilvl w:val="0"/>
+          <w:numId w:val="1"/>
+        </w:numPr>
+        <w:rPr>
+          <w:rFonts w:ascii="PalatinoLTPro" w:hAnsi="PalatinoLTPro"/>
+          <w:lang w:val="en-US"/>
+        </w:rPr>
+      </w:pPr>
+      <w:r>
+        <w:rPr>
+          <w:rFonts w:ascii="PalatinoLTPro" w:hAnsi="PalatinoLTPro"/>
         </w:rPr>
         <w:lastRenderedPageBreak/>
+        <w:t>Challenging</w:t>
+      </w:r>
+      <w:r>
+        <w:rPr>
+          <w:rFonts w:ascii="PalatinoLTPro" w:hAnsi="PalatinoLTPro"/>
+          <w:lang w:val="en-US"/>
+        </w:rPr>
+        <w:t>:</w:t>
+      </w:r>
+    </w:p>
+    <w:p>
+      <w:pPr>
+        <w:ind w:left="360"/>
+        <w:rPr>
+          <w:rFonts w:ascii="PalatinoLTPro" w:hAnsi="PalatinoLTPro"/>
+          <w:lang w:val="en-US"/>
+        </w:rPr>
+      </w:pPr>
+    </w:p>
+    <w:p>
+      <w:pPr>
+        <w:rPr>
+          <w:rFonts w:ascii="PalatinoLTPro" w:hAnsi="PalatinoLTPro"/>
+          <w:lang w:val="en-US"/>
+        </w:rPr>
+      </w:pPr>
+      <w:r>
+        <w:rPr>
+          <w:rFonts w:ascii="PalatinoLTPro" w:hAnsi="PalatinoLTPro"/>
+          <w:lang w:val="en-US"/>
+        </w:rPr>
         <w:drawing>
-          <wp:inline distT="0" distB="0" distL="0" distR="0" wp14:anchorId="1CE7D185" wp14:editId="27979BFB">
-            <wp:extent cx="5943600" cy="3754120"/>
-            <wp:effectExtent l="0" t="0" r="0" b="5080"/>
-            <wp:docPr id="3" name="Picture 3" descr="Table&#10;&#10;Description automatically generated"/>
+          <wp:inline distT="0" distB="0" distL="0" distR="0" wp14:anchorId="66D34549" wp14:editId="5748D6B3">
+            <wp:extent cx="5943600" cy="6721475"/>
+            <wp:effectExtent l="0" t="0" r="0" b="3175"/>
+            <wp:docPr id="5" name="Picture 5" descr="Text&#10;&#10;Description automatically generated"/>
             <wp:cNvGraphicFramePr>
               <a:graphicFrameLocks xmlns:a="http://schemas.openxmlformats.org/drawingml/2006/main" noChangeAspect="1"/>
             </wp:cNvGraphicFramePr>
@@ -190,7 +254,7 @@
               <a:graphicData uri="http://schemas.openxmlformats.org/drawingml/2006/picture">
                 <pic:pic xmlns:pic="http://schemas.openxmlformats.org/drawingml/2006/picture">
                   <pic:nvPicPr>
-                    <pic:cNvPr id="3" name="Picture 3" descr="Table&#10;&#10;Description automatically generated"/>
+                    <pic:cNvPr id="5" name="Picture 5" descr="Text&#10;&#10;Description automatically generated"/>
                     <pic:cNvPicPr/>
                   </pic:nvPicPr>
                   <pic:blipFill>
@@ -202,7 +266,7 @@
                   <pic:spPr>
                     <a:xfrm>
                       <a:off x="0" y="0"/>
-                      <a:ext cx="5943600" cy="3754120"/>
+                      <a:ext cx="5943600" cy="6721475"/>
                     </a:xfrm>
                     <a:prstGeom prst="rect">
                       <a:avLst/>
@@ -330,7 +394,7 @@
         <w:rFonts w:asciiTheme="minorHAnsi" w:eastAsiaTheme="minorHAnsi" w:hAnsiTheme="minorHAnsi" w:cstheme="minorBidi"/>
         <w:sz w:val="24"/>
         <w:szCs w:val="30"/>
-        <w:lang w:val="en-TH" w:eastAsia="en-US" w:bidi="th-TH"/>
+        <w:lang w:eastAsia="en-US" w:bidi="th-TH"/>
       </w:rPr>
     </w:rPrDefault>
     <w:pPrDefault/>

</xml_diff>